<commit_message>
Assignment-1: use base class reference for CardPayment in Q43
</commit_message>
<xml_diff>
--- a/Assignment-1/Amizone_Java.docx
+++ b/Assignment-1/Amizone_Java.docx
@@ -1,32 +1,31 @@
 
 <file path=word/document.xml><?xml version="1.0" encoding="utf-8"?>
-<w:document xmlns:wpc="http://schemas.microsoft.com/office/word/2010/wordprocessingCanvas" xmlns:cx="http://schemas.microsoft.com/office/drawing/2014/chartex" xmlns:cx1="http://schemas.microsoft.com/office/drawing/2015/9/8/chartex" xmlns:cx2="http://schemas.microsoft.com/office/drawing/2015/10/21/chartex" xmlns:cx3="http://schemas.microsoft.com/office/drawing/2016/5/9/chartex" xmlns:cx4="http://schemas.microsoft.com/office/drawing/2016/5/10/chartex" xmlns:cx5="http://schemas.microsoft.com/office/drawing/2016/5/11/chartex" xmlns:cx6="http://schemas.microsoft.com/office/drawing/2016/5/12/chartex" xmlns:cx7="http://schemas.microsoft.com/office/drawing/2016/5/13/chartex" xmlns:cx8="http://schemas.microsoft.com/office/drawing/2016/5/14/chartex" xmlns:mc="http://schemas.openxmlformats.org/markup-compatibility/2006" xmlns:aink="http://schemas.microsoft.com/office/drawing/2016/ink" xmlns:am3d="http://schemas.microsoft.com/office/drawing/2017/model3d" xmlns:o="urn:schemas-microsoft-com:office:office" xmlns:oel="http://schemas.microsoft.com/office/2019/extlst" xmlns:r="http://schemas.openxmlformats.org/officeDocument/2006/relationships" xmlns:m="http://schemas.openxmlformats.org/officeDocument/2006/math" xmlns:v="urn:schemas-microsoft-com:vml" xmlns:wp14="http://schemas.microsoft.com/office/word/2010/wordprocessingDrawing" xmlns:wp="http://schemas.openxmlformats.org/drawingml/2006/wordprocessingDrawing" xmlns:w10="urn:schemas-microsoft-com:office:word" xmlns:w="http://schemas.openxmlformats.org/wordprocessingml/2006/main" xmlns:w14="http://schemas.microsoft.com/office/word/2010/wordml" xmlns:w15="http://schemas.microsoft.com/office/word/2012/wordml" xmlns:w16cei="http://schemas.microsoft.com/office/word/2026/wordml/cei" xmlns:w16cex="http://schemas.microsoft.com/office/word/2018/wordml/cex" xmlns:w16cid="http://schemas.microsoft.com/office/word/2016/wordml/cid" xmlns:w16="http://schemas.microsoft.com/office/word/2018/wordml" xmlns:w16du="http://schemas.microsoft.com/office/word/2023/wordml/word16du" xmlns:w16sdtdh="http://schemas.microsoft.com/office/word/2020/wordml/sdtdatahash" xmlns:w16sdtfl="http://schemas.microsoft.com/office/word/2024/wordml/sdtformatlock" xmlns:w16se="http://schemas.microsoft.com/office/word/2015/wordml/symex" xmlns:wpg="http://schemas.microsoft.com/office/word/2010/wordprocessingGroup" xmlns:wpi="http://schemas.microsoft.com/office/word/2010/wordprocessingInk" xmlns:wne="http://schemas.microsoft.com/office/word/2006/wordml" xmlns:wps="http://schemas.microsoft.com/office/word/2010/wordprocessingShape" mc:Ignorable="w14 w15 w16se w16cid w16 w16cex w16sdtdh w16sdtfl w16du wp14">
+<w:document xmlns:wpc="http://schemas.microsoft.com/office/word/2010/wordprocessingCanvas" xmlns:cx="http://schemas.microsoft.com/office/drawing/2014/chartex" xmlns:cx1="http://schemas.microsoft.com/office/drawing/2015/9/8/chartex" xmlns:cx2="http://schemas.microsoft.com/office/drawing/2015/10/21/chartex" xmlns:cx3="http://schemas.microsoft.com/office/drawing/2016/5/9/chartex" xmlns:cx4="http://schemas.microsoft.com/office/drawing/2016/5/10/chartex" xmlns:cx5="http://schemas.microsoft.com/office/drawing/2016/5/11/chartex" xmlns:cx6="http://schemas.microsoft.com/office/drawing/2016/5/12/chartex" xmlns:cx7="http://schemas.microsoft.com/office/drawing/2016/5/13/chartex" xmlns:cx8="http://schemas.microsoft.com/office/drawing/2016/5/14/chartex" xmlns:mc="http://schemas.openxmlformats.org/markup-compatibility/2006" xmlns:aink="http://schemas.microsoft.com/office/drawing/2016/ink" xmlns:am3d="http://schemas.microsoft.com/office/drawing/2017/model3d" xmlns:o="urn:schemas-microsoft-com:office:office" xmlns:oel="http://schemas.microsoft.com/office/2019/extlst" xmlns:r="http://schemas.openxmlformats.org/officeDocument/2006/relationships" xmlns:m="http://schemas.openxmlformats.org/officeDocument/2006/math" xmlns:v="urn:schemas-microsoft-com:vml" xmlns:wp14="http://schemas.microsoft.com/office/word/2010/wordprocessingDrawing" xmlns:wp="http://schemas.openxmlformats.org/drawingml/2006/wordprocessingDrawing" xmlns:w10="urn:schemas-microsoft-com:office:word" xmlns:w="http://schemas.openxmlformats.org/wordprocessingml/2006/main" xmlns:w14="http://schemas.microsoft.com/office/word/2010/wordml" xmlns:w15="http://schemas.microsoft.com/office/word/2012/wordml" xmlns:w16cex="http://schemas.microsoft.com/office/word/2018/wordml/cex" xmlns:w16cid="http://schemas.microsoft.com/office/word/2016/wordml/cid" xmlns:w16="http://schemas.microsoft.com/office/word/2018/wordml" xmlns:w16du="http://schemas.microsoft.com/office/word/2023/wordml/word16du" xmlns:w16sdtdh="http://schemas.microsoft.com/office/word/2020/wordml/sdtdatahash" xmlns:w16sdtfl="http://schemas.microsoft.com/office/word/2024/wordml/sdtformatlock" xmlns:w16se="http://schemas.microsoft.com/office/word/2015/wordml/symex" xmlns:wpg="http://schemas.microsoft.com/office/word/2010/wordprocessingGroup" xmlns:wpi="http://schemas.microsoft.com/office/word/2010/wordprocessingInk" xmlns:wne="http://schemas.microsoft.com/office/word/2006/wordml" xmlns:wps="http://schemas.microsoft.com/office/word/2010/wordprocessingShape" mc:Ignorable="w14 w15 w16se w16cid w16 w16cex w16sdtdh w16sdtfl w16du wp14">
   <w:body>
     <w:p>
       <w:pPr>
         <w:rPr>
-          <w:sz w:val="72"/>
-          <w:szCs w:val="144"/>
+          <w:sz w:val="40"/>
+          <w:szCs w:val="48"/>
         </w:rPr>
       </w:pPr>
       <w:hyperlink r:id="rId6" w:history="1">
         <w:r>
           <w:rPr>
             <w:rStyle w:val="Hyperlink"/>
-            <w:sz w:val="72"/>
-            <w:szCs w:val="144"/>
+            <w:sz w:val="40"/>
+            <w:szCs w:val="48"/>
           </w:rPr>
-          <w:t>https://github.com/vitthalg17/java-assignments</w:t>
+          <w:t>https://github.com/vitthalg17/java-assignments/tree/master/Assignment-2</w:t>
         </w:r>
       </w:hyperlink>
-    </w:p>
-    <w:p>
-      <w:pPr>
+      <w:r>
         <w:rPr>
-          <w:sz w:val="72"/>
-          <w:szCs w:val="144"/>
+          <w:sz w:val="40"/>
+          <w:szCs w:val="48"/>
         </w:rPr>
-      </w:pPr>
+        <w:t xml:space="preserve"> </w:t>
+      </w:r>
     </w:p>
     <w:sectPr>
       <w:pgSz w:w="11906" w:h="16838"/>
@@ -39,7 +38,7 @@
 </file>
 
 <file path=word/endnotes.xml><?xml version="1.0" encoding="utf-8"?>
-<w:endnotes xmlns:wpc="http://schemas.microsoft.com/office/word/2010/wordprocessingCanvas" xmlns:cx="http://schemas.microsoft.com/office/drawing/2014/chartex" xmlns:cx1="http://schemas.microsoft.com/office/drawing/2015/9/8/chartex" xmlns:cx2="http://schemas.microsoft.com/office/drawing/2015/10/21/chartex" xmlns:cx3="http://schemas.microsoft.com/office/drawing/2016/5/9/chartex" xmlns:cx4="http://schemas.microsoft.com/office/drawing/2016/5/10/chartex" xmlns:cx5="http://schemas.microsoft.com/office/drawing/2016/5/11/chartex" xmlns:cx6="http://schemas.microsoft.com/office/drawing/2016/5/12/chartex" xmlns:cx7="http://schemas.microsoft.com/office/drawing/2016/5/13/chartex" xmlns:cx8="http://schemas.microsoft.com/office/drawing/2016/5/14/chartex" xmlns:mc="http://schemas.openxmlformats.org/markup-compatibility/2006" xmlns:aink="http://schemas.microsoft.com/office/drawing/2016/ink" xmlns:am3d="http://schemas.microsoft.com/office/drawing/2017/model3d" xmlns:o="urn:schemas-microsoft-com:office:office" xmlns:oel="http://schemas.microsoft.com/office/2019/extlst" xmlns:r="http://schemas.openxmlformats.org/officeDocument/2006/relationships" xmlns:m="http://schemas.openxmlformats.org/officeDocument/2006/math" xmlns:v="urn:schemas-microsoft-com:vml" xmlns:wp14="http://schemas.microsoft.com/office/word/2010/wordprocessingDrawing" xmlns:wp="http://schemas.openxmlformats.org/drawingml/2006/wordprocessingDrawing" xmlns:w10="urn:schemas-microsoft-com:office:word" xmlns:w="http://schemas.openxmlformats.org/wordprocessingml/2006/main" xmlns:w14="http://schemas.microsoft.com/office/word/2010/wordml" xmlns:w15="http://schemas.microsoft.com/office/word/2012/wordml" xmlns:w16cei="http://schemas.microsoft.com/office/word/2026/wordml/cei" xmlns:w16cex="http://schemas.microsoft.com/office/word/2018/wordml/cex" xmlns:w16cid="http://schemas.microsoft.com/office/word/2016/wordml/cid" xmlns:w16="http://schemas.microsoft.com/office/word/2018/wordml" xmlns:w16du="http://schemas.microsoft.com/office/word/2023/wordml/word16du" xmlns:w16sdtdh="http://schemas.microsoft.com/office/word/2020/wordml/sdtdatahash" xmlns:w16sdtfl="http://schemas.microsoft.com/office/word/2024/wordml/sdtformatlock" xmlns:w16se="http://schemas.microsoft.com/office/word/2015/wordml/symex" xmlns:wpg="http://schemas.microsoft.com/office/word/2010/wordprocessingGroup" xmlns:wpi="http://schemas.microsoft.com/office/word/2010/wordprocessingInk" xmlns:wne="http://schemas.microsoft.com/office/word/2006/wordml" xmlns:wps="http://schemas.microsoft.com/office/word/2010/wordprocessingShape" mc:Ignorable="w14 w15 w16se w16cid w16 w16cex w16sdtdh w16sdtfl w16du wp14">
+<w:endnotes xmlns:wpc="http://schemas.microsoft.com/office/word/2010/wordprocessingCanvas" xmlns:cx="http://schemas.microsoft.com/office/drawing/2014/chartex" xmlns:cx1="http://schemas.microsoft.com/office/drawing/2015/9/8/chartex" xmlns:cx2="http://schemas.microsoft.com/office/drawing/2015/10/21/chartex" xmlns:cx3="http://schemas.microsoft.com/office/drawing/2016/5/9/chartex" xmlns:cx4="http://schemas.microsoft.com/office/drawing/2016/5/10/chartex" xmlns:cx5="http://schemas.microsoft.com/office/drawing/2016/5/11/chartex" xmlns:cx6="http://schemas.microsoft.com/office/drawing/2016/5/12/chartex" xmlns:cx7="http://schemas.microsoft.com/office/drawing/2016/5/13/chartex" xmlns:cx8="http://schemas.microsoft.com/office/drawing/2016/5/14/chartex" xmlns:mc="http://schemas.openxmlformats.org/markup-compatibility/2006" xmlns:aink="http://schemas.microsoft.com/office/drawing/2016/ink" xmlns:am3d="http://schemas.microsoft.com/office/drawing/2017/model3d" xmlns:o="urn:schemas-microsoft-com:office:office" xmlns:oel="http://schemas.microsoft.com/office/2019/extlst" xmlns:r="http://schemas.openxmlformats.org/officeDocument/2006/relationships" xmlns:m="http://schemas.openxmlformats.org/officeDocument/2006/math" xmlns:v="urn:schemas-microsoft-com:vml" xmlns:wp14="http://schemas.microsoft.com/office/word/2010/wordprocessingDrawing" xmlns:wp="http://schemas.openxmlformats.org/drawingml/2006/wordprocessingDrawing" xmlns:w10="urn:schemas-microsoft-com:office:word" xmlns:w="http://schemas.openxmlformats.org/wordprocessingml/2006/main" xmlns:w14="http://schemas.microsoft.com/office/word/2010/wordml" xmlns:w15="http://schemas.microsoft.com/office/word/2012/wordml" xmlns:w16cex="http://schemas.microsoft.com/office/word/2018/wordml/cex" xmlns:w16cid="http://schemas.microsoft.com/office/word/2016/wordml/cid" xmlns:w16="http://schemas.microsoft.com/office/word/2018/wordml" xmlns:w16du="http://schemas.microsoft.com/office/word/2023/wordml/word16du" xmlns:w16sdtdh="http://schemas.microsoft.com/office/word/2020/wordml/sdtdatahash" xmlns:w16sdtfl="http://schemas.microsoft.com/office/word/2024/wordml/sdtformatlock" xmlns:w16se="http://schemas.microsoft.com/office/word/2015/wordml/symex" xmlns:wpg="http://schemas.microsoft.com/office/word/2010/wordprocessingGroup" xmlns:wpi="http://schemas.microsoft.com/office/word/2010/wordprocessingInk" xmlns:wne="http://schemas.microsoft.com/office/word/2006/wordml" xmlns:wps="http://schemas.microsoft.com/office/word/2010/wordprocessingShape" mc:Ignorable="w14 w15 w16se w16cid w16 w16cex w16sdtdh w16sdtfl w16du wp14">
   <w:endnote w:type="separator" w:id="-1">
     <w:p>
       <w:pPr>
@@ -64,7 +63,7 @@
 </file>
 
 <file path=word/footnotes.xml><?xml version="1.0" encoding="utf-8"?>
-<w:footnotes xmlns:wpc="http://schemas.microsoft.com/office/word/2010/wordprocessingCanvas" xmlns:cx="http://schemas.microsoft.com/office/drawing/2014/chartex" xmlns:cx1="http://schemas.microsoft.com/office/drawing/2015/9/8/chartex" xmlns:cx2="http://schemas.microsoft.com/office/drawing/2015/10/21/chartex" xmlns:cx3="http://schemas.microsoft.com/office/drawing/2016/5/9/chartex" xmlns:cx4="http://schemas.microsoft.com/office/drawing/2016/5/10/chartex" xmlns:cx5="http://schemas.microsoft.com/office/drawing/2016/5/11/chartex" xmlns:cx6="http://schemas.microsoft.com/office/drawing/2016/5/12/chartex" xmlns:cx7="http://schemas.microsoft.com/office/drawing/2016/5/13/chartex" xmlns:cx8="http://schemas.microsoft.com/office/drawing/2016/5/14/chartex" xmlns:mc="http://schemas.openxmlformats.org/markup-compatibility/2006" xmlns:aink="http://schemas.microsoft.com/office/drawing/2016/ink" xmlns:am3d="http://schemas.microsoft.com/office/drawing/2017/model3d" xmlns:o="urn:schemas-microsoft-com:office:office" xmlns:oel="http://schemas.microsoft.com/office/2019/extlst" xmlns:r="http://schemas.openxmlformats.org/officeDocument/2006/relationships" xmlns:m="http://schemas.openxmlformats.org/officeDocument/2006/math" xmlns:v="urn:schemas-microsoft-com:vml" xmlns:wp14="http://schemas.microsoft.com/office/word/2010/wordprocessingDrawing" xmlns:wp="http://schemas.openxmlformats.org/drawingml/2006/wordprocessingDrawing" xmlns:w10="urn:schemas-microsoft-com:office:word" xmlns:w="http://schemas.openxmlformats.org/wordprocessingml/2006/main" xmlns:w14="http://schemas.microsoft.com/office/word/2010/wordml" xmlns:w15="http://schemas.microsoft.com/office/word/2012/wordml" xmlns:w16cei="http://schemas.microsoft.com/office/word/2026/wordml/cei" xmlns:w16cex="http://schemas.microsoft.com/office/word/2018/wordml/cex" xmlns:w16cid="http://schemas.microsoft.com/office/word/2016/wordml/cid" xmlns:w16="http://schemas.microsoft.com/office/word/2018/wordml" xmlns:w16du="http://schemas.microsoft.com/office/word/2023/wordml/word16du" xmlns:w16sdtdh="http://schemas.microsoft.com/office/word/2020/wordml/sdtdatahash" xmlns:w16sdtfl="http://schemas.microsoft.com/office/word/2024/wordml/sdtformatlock" xmlns:w16se="http://schemas.microsoft.com/office/word/2015/wordml/symex" xmlns:wpg="http://schemas.microsoft.com/office/word/2010/wordprocessingGroup" xmlns:wpi="http://schemas.microsoft.com/office/word/2010/wordprocessingInk" xmlns:wne="http://schemas.microsoft.com/office/word/2006/wordml" xmlns:wps="http://schemas.microsoft.com/office/word/2010/wordprocessingShape" mc:Ignorable="w14 w15 w16se w16cid w16 w16cex w16sdtdh w16sdtfl w16du wp14">
+<w:footnotes xmlns:wpc="http://schemas.microsoft.com/office/word/2010/wordprocessingCanvas" xmlns:cx="http://schemas.microsoft.com/office/drawing/2014/chartex" xmlns:cx1="http://schemas.microsoft.com/office/drawing/2015/9/8/chartex" xmlns:cx2="http://schemas.microsoft.com/office/drawing/2015/10/21/chartex" xmlns:cx3="http://schemas.microsoft.com/office/drawing/2016/5/9/chartex" xmlns:cx4="http://schemas.microsoft.com/office/drawing/2016/5/10/chartex" xmlns:cx5="http://schemas.microsoft.com/office/drawing/2016/5/11/chartex" xmlns:cx6="http://schemas.microsoft.com/office/drawing/2016/5/12/chartex" xmlns:cx7="http://schemas.microsoft.com/office/drawing/2016/5/13/chartex" xmlns:cx8="http://schemas.microsoft.com/office/drawing/2016/5/14/chartex" xmlns:mc="http://schemas.openxmlformats.org/markup-compatibility/2006" xmlns:aink="http://schemas.microsoft.com/office/drawing/2016/ink" xmlns:am3d="http://schemas.microsoft.com/office/drawing/2017/model3d" xmlns:o="urn:schemas-microsoft-com:office:office" xmlns:oel="http://schemas.microsoft.com/office/2019/extlst" xmlns:r="http://schemas.openxmlformats.org/officeDocument/2006/relationships" xmlns:m="http://schemas.openxmlformats.org/officeDocument/2006/math" xmlns:v="urn:schemas-microsoft-com:vml" xmlns:wp14="http://schemas.microsoft.com/office/word/2010/wordprocessingDrawing" xmlns:wp="http://schemas.openxmlformats.org/drawingml/2006/wordprocessingDrawing" xmlns:w10="urn:schemas-microsoft-com:office:word" xmlns:w="http://schemas.openxmlformats.org/wordprocessingml/2006/main" xmlns:w14="http://schemas.microsoft.com/office/word/2010/wordml" xmlns:w15="http://schemas.microsoft.com/office/word/2012/wordml" xmlns:w16cex="http://schemas.microsoft.com/office/word/2018/wordml/cex" xmlns:w16cid="http://schemas.microsoft.com/office/word/2016/wordml/cid" xmlns:w16="http://schemas.microsoft.com/office/word/2018/wordml" xmlns:w16du="http://schemas.microsoft.com/office/word/2023/wordml/word16du" xmlns:w16sdtdh="http://schemas.microsoft.com/office/word/2020/wordml/sdtdatahash" xmlns:w16sdtfl="http://schemas.microsoft.com/office/word/2024/wordml/sdtformatlock" xmlns:w16se="http://schemas.microsoft.com/office/word/2015/wordml/symex" xmlns:wpg="http://schemas.microsoft.com/office/word/2010/wordprocessingGroup" xmlns:wpi="http://schemas.microsoft.com/office/word/2010/wordprocessingInk" xmlns:wne="http://schemas.microsoft.com/office/word/2006/wordml" xmlns:wps="http://schemas.microsoft.com/office/word/2010/wordprocessingShape" mc:Ignorable="w14 w15 w16se w16cid w16 w16cex w16sdtdh w16sdtfl w16du wp14">
   <w:footnote w:type="separator" w:id="-1">
     <w:p>
       <w:pPr>

</xml_diff>